<commit_message>
add information to project charter
</commit_message>
<xml_diff>
--- a/_assets/projectDocs/Project Charter.docx
+++ b/_assets/projectDocs/Project Charter.docx
@@ -56,25 +56,7 @@
           <w:szCs w:val="56"/>
           <w:lang w:val="en-029"/>
         </w:rPr>
-        <w:t xml:space="preserve">Weyland </w:t>
-      </w:r>
-      <w:proofErr w:type="gramStart"/>
-      <w:r>
-        <w:rPr>
-          <w:sz w:val="56"/>
-          <w:szCs w:val="56"/>
-          <w:lang w:val="en-029"/>
-        </w:rPr>
-        <w:t>Yutani :</w:t>
-      </w:r>
-      <w:proofErr w:type="gramEnd"/>
-      <w:r>
-        <w:rPr>
-          <w:sz w:val="56"/>
-          <w:szCs w:val="56"/>
-          <w:lang w:val="en-029"/>
-        </w:rPr>
-        <w:t xml:space="preserve"> Electronic Claims System</w:t>
+        <w:t>Weyland Yutani : Electronic Claims System</w:t>
       </w:r>
     </w:p>
     <w:p>
@@ -888,6 +870,7 @@
       <w:bookmarkStart w:id="9" w:name="_Toc207430131"/>
       <w:bookmarkStart w:id="10" w:name="_Toc342560524"/>
       <w:r>
+        <w:lastRenderedPageBreak/>
         <w:br w:type="page"/>
       </w:r>
     </w:p>
@@ -1356,23 +1339,13 @@
           <w:szCs w:val="24"/>
         </w:rPr>
       </w:pPr>
-      <w:proofErr w:type="gramStart"/>
       <w:r>
         <w:rPr>
           <w:rFonts w:ascii="Verdana" w:hAnsi="Verdana" w:cs="Calibri"/>
           <w:sz w:val="20"/>
           <w:szCs w:val="24"/>
         </w:rPr>
-        <w:t>Admin submission</w:t>
-      </w:r>
-      <w:proofErr w:type="gramEnd"/>
-      <w:r>
-        <w:rPr>
-          <w:rFonts w:ascii="Verdana" w:hAnsi="Verdana" w:cs="Calibri"/>
-          <w:sz w:val="20"/>
-          <w:szCs w:val="24"/>
-        </w:rPr>
-        <w:t xml:space="preserve"> of claims for employees.</w:t>
+        <w:t>Admin submission of claims for employees.</w:t>
       </w:r>
     </w:p>
     <w:p>
@@ -1923,6 +1896,12 @@
               </w:rPr>
               <w:t xml:space="preserve"> Wireframe for webpage design.</w:t>
             </w:r>
+            <w:r>
+              <w:rPr>
+                <w:rFonts w:ascii="Verdana" w:hAnsi="Verdana"/>
+              </w:rPr>
+              <w:t xml:space="preserve"> Workflow setup.</w:t>
+            </w:r>
           </w:p>
         </w:tc>
       </w:tr>
@@ -1977,14 +1956,212 @@
               <w:rPr>
                 <w:rFonts w:ascii="Verdana" w:hAnsi="Verdana"/>
                 <w:color w:val="808080"/>
-                <w:sz w:val="16"/>
-              </w:rPr>
-            </w:pPr>
-            <w:r>
+                <w:szCs w:val="20"/>
+              </w:rPr>
+            </w:pPr>
+            <w:r>
+              <w:rPr>
+                <w:rFonts w:ascii="Verdana" w:hAnsi="Verdana"/>
+                <w:szCs w:val="20"/>
+              </w:rPr>
+              <w:t>2026-22-01</w:t>
+            </w:r>
+          </w:p>
+        </w:tc>
+      </w:tr>
+      <w:tr>
+        <w:trPr>
+          <w:cantSplit/>
+          <w:tblHeader/>
+        </w:trPr>
+        <w:tc>
+          <w:tcPr>
+            <w:tcW w:w="1795" w:type="dxa"/>
+            <w:shd w:val="clear" w:color="auto" w:fill="737373"/>
+            <w:tcMar>
+              <w:top w:w="29" w:type="dxa"/>
+              <w:left w:w="115" w:type="dxa"/>
+              <w:bottom w:w="29" w:type="dxa"/>
+              <w:right w:w="115" w:type="dxa"/>
+            </w:tcMar>
+            <w:vAlign w:val="center"/>
+          </w:tcPr>
+          <w:p>
+            <w:pPr>
+              <w:pStyle w:val="TableYears"/>
+              <w:spacing w:before="0" w:after="0"/>
+              <w:rPr>
+                <w:rFonts w:ascii="Verdana" w:hAnsi="Verdana"/>
+                <w:b/>
+                <w:szCs w:val="16"/>
+              </w:rPr>
+            </w:pPr>
+            <w:r>
+              <w:rPr>
+                <w:rFonts w:ascii="Verdana" w:hAnsi="Verdana"/>
+                <w:b/>
+                <w:szCs w:val="16"/>
+              </w:rPr>
+              <w:t>Milestone 3</w:t>
+            </w:r>
+            <w:r>
+              <w:rPr>
+                <w:rFonts w:ascii="Verdana" w:hAnsi="Verdana"/>
+                <w:b/>
+                <w:szCs w:val="16"/>
+              </w:rPr>
+              <w:t>:</w:t>
+            </w:r>
+          </w:p>
+        </w:tc>
+        <w:tc>
+          <w:tcPr>
+            <w:tcW w:w="7553" w:type="dxa"/>
+            <w:shd w:val="clear" w:color="auto" w:fill="737373"/>
+            <w:vAlign w:val="center"/>
+          </w:tcPr>
+          <w:p>
+            <w:pPr>
+              <w:pStyle w:val="TableYears"/>
+              <w:spacing w:before="0" w:after="0"/>
+              <w:jc w:val="center"/>
+              <w:rPr>
+                <w:rFonts w:ascii="Verdana" w:hAnsi="Verdana"/>
+                <w:b/>
+                <w:szCs w:val="16"/>
+              </w:rPr>
+            </w:pPr>
+            <w:r>
+              <w:rPr>
+                <w:rFonts w:ascii="Verdana" w:hAnsi="Verdana"/>
+                <w:b/>
+                <w:szCs w:val="16"/>
+              </w:rPr>
+              <w:t>Database and Web App</w:t>
+            </w:r>
+          </w:p>
+        </w:tc>
+      </w:tr>
+      <w:tr>
+        <w:trPr>
+          <w:cantSplit/>
+        </w:trPr>
+        <w:tc>
+          <w:tcPr>
+            <w:tcW w:w="1795" w:type="dxa"/>
+            <w:shd w:val="clear" w:color="auto" w:fill="FFFFFF"/>
+            <w:tcMar>
+              <w:top w:w="29" w:type="dxa"/>
+              <w:left w:w="115" w:type="dxa"/>
+              <w:bottom w:w="29" w:type="dxa"/>
+              <w:right w:w="115" w:type="dxa"/>
+            </w:tcMar>
+            <w:vAlign w:val="center"/>
+          </w:tcPr>
+          <w:p>
+            <w:pPr>
+              <w:pStyle w:val="TableText"/>
+              <w:spacing w:before="0" w:after="0"/>
+              <w:rPr>
+                <w:rFonts w:ascii="Verdana" w:hAnsi="Verdana"/>
+              </w:rPr>
+            </w:pPr>
+            <w:r>
+              <w:rPr>
+                <w:rFonts w:ascii="Verdana" w:hAnsi="Verdana"/>
+              </w:rPr>
+              <w:t xml:space="preserve">Description: </w:t>
+            </w:r>
+          </w:p>
+        </w:tc>
+        <w:tc>
+          <w:tcPr>
+            <w:tcW w:w="7553" w:type="dxa"/>
+            <w:shd w:val="clear" w:color="auto" w:fill="FFFFFF" w:themeFill="background1"/>
+            <w:tcMar>
+              <w:top w:w="29" w:type="dxa"/>
+              <w:left w:w="115" w:type="dxa"/>
+              <w:bottom w:w="29" w:type="dxa"/>
+              <w:right w:w="115" w:type="dxa"/>
+            </w:tcMar>
+            <w:vAlign w:val="center"/>
+          </w:tcPr>
+          <w:p>
+            <w:pPr>
+              <w:pStyle w:val="TableText"/>
+              <w:spacing w:before="0" w:after="0"/>
               <w:rPr>
                 <w:rFonts w:ascii="Verdana" w:hAnsi="Verdana"/>
                 <w:color w:val="808080"/>
-                <w:sz w:val="16"/>
+              </w:rPr>
+            </w:pPr>
+            <w:r>
+              <w:rPr>
+                <w:rFonts w:ascii="Verdana" w:hAnsi="Verdana"/>
+              </w:rPr>
+              <w:t>Development of a basic ITPW, database API and deployment testing.</w:t>
+            </w:r>
+          </w:p>
+        </w:tc>
+      </w:tr>
+      <w:tr>
+        <w:trPr>
+          <w:cantSplit/>
+        </w:trPr>
+        <w:tc>
+          <w:tcPr>
+            <w:tcW w:w="1795" w:type="dxa"/>
+            <w:shd w:val="clear" w:color="auto" w:fill="FFFFFF"/>
+            <w:tcMar>
+              <w:top w:w="29" w:type="dxa"/>
+              <w:left w:w="115" w:type="dxa"/>
+              <w:bottom w:w="29" w:type="dxa"/>
+              <w:right w:w="115" w:type="dxa"/>
+            </w:tcMar>
+            <w:vAlign w:val="center"/>
+          </w:tcPr>
+          <w:p>
+            <w:pPr>
+              <w:pStyle w:val="TableText"/>
+              <w:spacing w:before="0" w:after="0"/>
+              <w:rPr>
+                <w:rFonts w:ascii="Verdana" w:hAnsi="Verdana"/>
+              </w:rPr>
+            </w:pPr>
+            <w:r>
+              <w:rPr>
+                <w:rFonts w:ascii="Verdana" w:hAnsi="Verdana"/>
+              </w:rPr>
+              <w:t xml:space="preserve">Due date: </w:t>
+            </w:r>
+          </w:p>
+        </w:tc>
+        <w:tc>
+          <w:tcPr>
+            <w:tcW w:w="7553" w:type="dxa"/>
+            <w:shd w:val="clear" w:color="auto" w:fill="FFFFFF"/>
+            <w:tcMar>
+              <w:top w:w="29" w:type="dxa"/>
+              <w:left w:w="115" w:type="dxa"/>
+              <w:bottom w:w="29" w:type="dxa"/>
+              <w:right w:w="115" w:type="dxa"/>
+            </w:tcMar>
+            <w:vAlign w:val="center"/>
+          </w:tcPr>
+          <w:p>
+            <w:pPr>
+              <w:pStyle w:val="TableText"/>
+              <w:spacing w:before="0" w:after="0"/>
+              <w:rPr>
+                <w:rFonts w:ascii="Verdana" w:hAnsi="Verdana"/>
+                <w:color w:val="808080"/>
+                <w:szCs w:val="20"/>
+              </w:rPr>
+            </w:pPr>
+            <w:r>
+              <w:rPr>
+                <w:rFonts w:ascii="Verdana" w:hAnsi="Verdana"/>
+                <w:szCs w:val="20"/>
               </w:rPr>
               <w:t>???</w:t>
             </w:r>
@@ -2622,10 +2799,9 @@
             <w:r>
               <w:rPr>
                 <w:rFonts w:ascii="Verdana" w:hAnsi="Verdana"/>
-                <w:color w:val="808080"/>
-                <w:sz w:val="16"/>
-              </w:rPr>
-              <w:t>???</w:t>
+                <w:szCs w:val="20"/>
+              </w:rPr>
+              <w:t>2026-22-01</w:t>
             </w:r>
           </w:p>
         </w:tc>
@@ -3327,7 +3503,6 @@
           <w:rFonts w:ascii="Verdana" w:hAnsi="Verdana"/>
           <w:sz w:val="20"/>
         </w:rPr>
-        <w:lastRenderedPageBreak/>
         <w:t>Disorganized style leading to cumbersome code.</w:t>
       </w:r>
     </w:p>
@@ -3355,23 +3530,7 @@
           <w:rFonts w:ascii="Verdana" w:hAnsi="Verdana"/>
           <w:sz w:val="20"/>
         </w:rPr>
-        <w:t xml:space="preserve"> </w:t>
-      </w:r>
-      <w:proofErr w:type="gramStart"/>
-      <w:r>
-        <w:rPr>
-          <w:rFonts w:ascii="Verdana" w:hAnsi="Verdana"/>
-          <w:sz w:val="20"/>
-        </w:rPr>
-        <w:t>leading</w:t>
-      </w:r>
-      <w:proofErr w:type="gramEnd"/>
-      <w:r>
-        <w:rPr>
-          <w:rFonts w:ascii="Verdana" w:hAnsi="Verdana"/>
-          <w:sz w:val="20"/>
-        </w:rPr>
-        <w:t xml:space="preserve"> to confusion.</w:t>
+        <w:t xml:space="preserve"> leading to confusion.</w:t>
       </w:r>
     </w:p>
     <w:p>
@@ -3468,6 +3627,7 @@
       <w:bookmarkStart w:id="31" w:name="_Toc207430147"/>
       <w:bookmarkStart w:id="32" w:name="_Toc342560529"/>
       <w:r>
+        <w:lastRenderedPageBreak/>
         <w:br w:type="page"/>
       </w:r>
     </w:p>
@@ -3494,85 +3654,6 @@
       <w:bookmarkStart w:id="36" w:name="_Toc342560530"/>
       <w:r>
         <w:t>3.1 Stakeholders</w:t>
-      </w:r>
-    </w:p>
-    <w:p>
-      <w:pPr>
-        <w:spacing w:line="300" w:lineRule="atLeast"/>
-        <w:rPr>
-          <w:rFonts w:ascii="Verdana" w:hAnsi="Verdana" w:cs="Segoe UI"/>
-          <w:i/>
-          <w:color w:val="A6A6A6" w:themeColor="background1" w:themeShade="A6"/>
-          <w:sz w:val="20"/>
-          <w:szCs w:val="20"/>
-          <w:lang w:eastAsia="en-US"/>
-        </w:rPr>
-      </w:pPr>
-      <w:r>
-        <w:rPr>
-          <w:rFonts w:ascii="Verdana" w:hAnsi="Verdana"/>
-          <w:i/>
-          <w:color w:val="A6A6A6" w:themeColor="background1" w:themeShade="A6"/>
-          <w:sz w:val="20"/>
-          <w:szCs w:val="20"/>
-          <w:lang w:eastAsia="en-US"/>
-        </w:rPr>
-        <w:t>[</w:t>
-      </w:r>
-      <w:r>
-        <w:rPr>
-          <w:rFonts w:ascii="Verdana" w:hAnsi="Verdana" w:cs="Segoe UI"/>
-          <w:i/>
-          <w:color w:val="A6A6A6" w:themeColor="background1" w:themeShade="A6"/>
-          <w:sz w:val="20"/>
-          <w:szCs w:val="20"/>
-        </w:rPr>
-        <w:t xml:space="preserve">Stakeholders are </w:t>
-      </w:r>
-      <w:r>
-        <w:rPr>
-          <w:rStyle w:val="Strong"/>
-          <w:rFonts w:ascii="Verdana" w:hAnsi="Verdana" w:cs="Segoe UI"/>
-          <w:b w:val="0"/>
-          <w:bCs w:val="0"/>
-          <w:i/>
-          <w:color w:val="A6A6A6" w:themeColor="background1" w:themeShade="A6"/>
-          <w:sz w:val="20"/>
-          <w:szCs w:val="20"/>
-        </w:rPr>
-        <w:t>individuals or groups who have an interest in the success or outcome of a project</w:t>
-      </w:r>
-      <w:r>
-        <w:rPr>
-          <w:rFonts w:ascii="Verdana" w:hAnsi="Verdana" w:cs="Segoe UI"/>
-          <w:i/>
-          <w:color w:val="A6A6A6" w:themeColor="background1" w:themeShade="A6"/>
-          <w:sz w:val="20"/>
-          <w:szCs w:val="20"/>
-        </w:rPr>
-        <w:t>. They can influence the project or be affected by it.</w:t>
-      </w:r>
-      <w:r>
-        <w:rPr>
-          <w:rFonts w:ascii="Verdana" w:hAnsi="Verdana" w:cs="Segoe UI"/>
-          <w:i/>
-          <w:color w:val="A6A6A6" w:themeColor="background1" w:themeShade="A6"/>
-          <w:sz w:val="20"/>
-          <w:szCs w:val="20"/>
-          <w:lang w:eastAsia="en-US"/>
-        </w:rPr>
-        <w:t xml:space="preserve"> List them below…</w:t>
-      </w:r>
-      <w:r>
-        <w:rPr>
-          <w:rFonts w:ascii="Verdana" w:hAnsi="Verdana"/>
-          <w:i/>
-          <w:color w:val="A6A6A6" w:themeColor="background1" w:themeShade="A6"/>
-          <w:sz w:val="20"/>
-          <w:szCs w:val="20"/>
-          <w:lang w:eastAsia="en-US"/>
-        </w:rPr>
-        <w:t>]</w:t>
       </w:r>
     </w:p>
     <w:p>
@@ -3694,10 +3775,7 @@
               </w:rPr>
             </w:pPr>
             <w:r>
-              <w:rPr>
-                <w:color w:val="808080"/>
-              </w:rPr>
-              <w:t>???</w:t>
+              <w:t>Sean Morrow</w:t>
             </w:r>
           </w:p>
         </w:tc>
@@ -3734,11 +3812,13 @@
               </w:rPr>
             </w:pPr>
             <w:r>
-              <w:rPr>
-                <w:color w:val="808080"/>
-              </w:rPr>
-              <w:t>???</w:t>
-            </w:r>
+              <w:t xml:space="preserve">Wayland </w:t>
+            </w:r>
+            <w:proofErr w:type="spellStart"/>
+            <w:r>
+              <w:t>Ytani</w:t>
+            </w:r>
+            <w:proofErr w:type="spellEnd"/>
           </w:p>
         </w:tc>
       </w:tr>
@@ -3773,11 +3853,21 @@
               </w:rPr>
             </w:pPr>
             <w:r>
-              <w:rPr>
-                <w:color w:val="808080"/>
-              </w:rPr>
-              <w:t>???</w:t>
-            </w:r>
+              <w:t xml:space="preserve">Wayland </w:t>
+            </w:r>
+            <w:proofErr w:type="spellStart"/>
+            <w:r>
+              <w:t>Ytani</w:t>
+            </w:r>
+            <w:proofErr w:type="spellEnd"/>
+            <w:r>
+              <w:t xml:space="preserve"> </w:t>
+            </w:r>
+            <w:proofErr w:type="spellStart"/>
+            <w:r>
+              <w:t>Satff</w:t>
+            </w:r>
+            <w:proofErr w:type="spellEnd"/>
           </w:p>
         </w:tc>
       </w:tr>
@@ -3808,14 +3898,36 @@
             <w:pPr>
               <w:pStyle w:val="TableText"/>
               <w:rPr>
+                <w:szCs w:val="20"/>
+              </w:rPr>
+            </w:pPr>
+            <w:r>
+              <w:rPr>
+                <w:szCs w:val="20"/>
+              </w:rPr>
+              <w:t xml:space="preserve">Drew </w:t>
+            </w:r>
+            <w:proofErr w:type="spellStart"/>
+            <w:r>
+              <w:rPr>
+                <w:szCs w:val="20"/>
+              </w:rPr>
+              <w:t>Maceachern</w:t>
+            </w:r>
+            <w:proofErr w:type="spellEnd"/>
+          </w:p>
+          <w:p>
+            <w:pPr>
+              <w:pStyle w:val="TableText"/>
+              <w:rPr>
                 <w:color w:val="808080"/>
               </w:rPr>
             </w:pPr>
             <w:r>
               <w:rPr>
-                <w:color w:val="808080"/>
-              </w:rPr>
-              <w:t>???</w:t>
+                <w:szCs w:val="20"/>
+              </w:rPr>
+              <w:t>James Wilson</w:t>
             </w:r>
           </w:p>
         </w:tc>
@@ -3846,15 +3958,20 @@
           <w:p>
             <w:pPr>
               <w:pStyle w:val="TableText"/>
+            </w:pPr>
+            <w:r>
+              <w:t>Sean Morrow</w:t>
+            </w:r>
+          </w:p>
+          <w:p>
+            <w:pPr>
+              <w:pStyle w:val="TableText"/>
               <w:rPr>
                 <w:color w:val="808080"/>
               </w:rPr>
             </w:pPr>
             <w:r>
-              <w:rPr>
-                <w:color w:val="808080"/>
-              </w:rPr>
-              <w:t>???</w:t>
+              <w:t>Ryan McLaren</w:t>
             </w:r>
           </w:p>
         </w:tc>
@@ -3882,27 +3999,6 @@
       <w:bookmarkEnd w:id="34"/>
       <w:bookmarkEnd w:id="35"/>
       <w:bookmarkEnd w:id="36"/>
-    </w:p>
-    <w:p>
-      <w:pPr>
-        <w:rPr>
-          <w:rFonts w:ascii="Verdana" w:hAnsi="Verdana"/>
-          <w:i/>
-          <w:color w:val="808080"/>
-          <w:sz w:val="20"/>
-          <w:lang w:eastAsia="en-US"/>
-        </w:rPr>
-      </w:pPr>
-      <w:r>
-        <w:rPr>
-          <w:rFonts w:ascii="Verdana" w:hAnsi="Verdana"/>
-          <w:i/>
-          <w:color w:val="808080"/>
-          <w:sz w:val="20"/>
-          <w:lang w:eastAsia="en-US"/>
-        </w:rPr>
-        <w:t>[In the following section you outline the roles the team members will play in the project development. Below are some examples, but note that they might not apply to your project, and others might have to be added]</w:t>
-      </w:r>
     </w:p>
     <w:p>
       <w:pPr>
@@ -4059,15 +4155,23 @@
             <w:pPr>
               <w:pStyle w:val="TableText"/>
               <w:rPr>
-                <w:color w:val="808080"/>
-              </w:rPr>
-            </w:pPr>
-            <w:r>
-              <w:rPr>
-                <w:color w:val="808080"/>
-              </w:rPr>
-              <w:t>???</w:t>
-            </w:r>
+                <w:szCs w:val="20"/>
+              </w:rPr>
+            </w:pPr>
+            <w:r>
+              <w:rPr>
+                <w:szCs w:val="20"/>
+              </w:rPr>
+              <w:t xml:space="preserve">Drew </w:t>
+            </w:r>
+            <w:proofErr w:type="spellStart"/>
+            <w:r>
+              <w:rPr>
+                <w:szCs w:val="20"/>
+              </w:rPr>
+              <w:t>Maceachern</w:t>
+            </w:r>
+            <w:proofErr w:type="spellEnd"/>
           </w:p>
         </w:tc>
       </w:tr>
@@ -4099,15 +4203,7 @@
               <w:pStyle w:val="TableText"/>
             </w:pPr>
             <w:r>
-              <w:t xml:space="preserve">Database and </w:t>
-            </w:r>
-            <w:proofErr w:type="gramStart"/>
-            <w:r>
-              <w:t>back end</w:t>
-            </w:r>
-            <w:proofErr w:type="gramEnd"/>
-            <w:r>
-              <w:t xml:space="preserve"> development</w:t>
+              <w:t>Database and back end development</w:t>
             </w:r>
           </w:p>
         </w:tc>
@@ -4124,10 +4220,7 @@
               </w:rPr>
             </w:pPr>
             <w:r>
-              <w:rPr>
-                <w:color w:val="808080"/>
-              </w:rPr>
-              <w:t>???</w:t>
+              <w:t>James Wilson</w:t>
             </w:r>
           </w:p>
         </w:tc>
@@ -4160,15 +4253,7 @@
               <w:pStyle w:val="TableText"/>
             </w:pPr>
             <w:r>
-              <w:t xml:space="preserve">User interface design and </w:t>
-            </w:r>
-            <w:proofErr w:type="gramStart"/>
-            <w:r>
-              <w:t>back end</w:t>
-            </w:r>
-            <w:proofErr w:type="gramEnd"/>
-            <w:r>
-              <w:t xml:space="preserve"> development</w:t>
+              <w:t>User interface design and back end development</w:t>
             </w:r>
           </w:p>
         </w:tc>
@@ -4181,14 +4266,36 @@
             <w:pPr>
               <w:pStyle w:val="TableText"/>
               <w:rPr>
+                <w:szCs w:val="20"/>
+              </w:rPr>
+            </w:pPr>
+            <w:r>
+              <w:rPr>
+                <w:szCs w:val="20"/>
+              </w:rPr>
+              <w:t xml:space="preserve">Drew </w:t>
+            </w:r>
+            <w:proofErr w:type="spellStart"/>
+            <w:r>
+              <w:rPr>
+                <w:szCs w:val="20"/>
+              </w:rPr>
+              <w:t>Maceachern</w:t>
+            </w:r>
+            <w:proofErr w:type="spellEnd"/>
+          </w:p>
+          <w:p>
+            <w:pPr>
+              <w:pStyle w:val="TableText"/>
+              <w:rPr>
                 <w:color w:val="808080"/>
               </w:rPr>
             </w:pPr>
             <w:r>
               <w:rPr>
-                <w:color w:val="808080"/>
-              </w:rPr>
-              <w:t>???</w:t>
+                <w:szCs w:val="20"/>
+              </w:rPr>
+              <w:t>James Wilson</w:t>
             </w:r>
           </w:p>
         </w:tc>
@@ -4234,14 +4341,36 @@
             <w:pPr>
               <w:pStyle w:val="TableText"/>
               <w:rPr>
+                <w:szCs w:val="20"/>
+              </w:rPr>
+            </w:pPr>
+            <w:r>
+              <w:rPr>
+                <w:szCs w:val="20"/>
+              </w:rPr>
+              <w:t xml:space="preserve">Drew </w:t>
+            </w:r>
+            <w:proofErr w:type="spellStart"/>
+            <w:r>
+              <w:rPr>
+                <w:szCs w:val="20"/>
+              </w:rPr>
+              <w:t>Maceachern</w:t>
+            </w:r>
+            <w:proofErr w:type="spellEnd"/>
+          </w:p>
+          <w:p>
+            <w:pPr>
+              <w:pStyle w:val="TableText"/>
+              <w:rPr>
                 <w:color w:val="808080"/>
               </w:rPr>
             </w:pPr>
             <w:r>
               <w:rPr>
-                <w:color w:val="808080"/>
-              </w:rPr>
-              <w:t>???</w:t>
+                <w:szCs w:val="20"/>
+              </w:rPr>
+              <w:t>James Wilson</w:t>
             </w:r>
           </w:p>
         </w:tc>
@@ -4291,10 +4420,7 @@
               </w:rPr>
             </w:pPr>
             <w:r>
-              <w:rPr>
-                <w:color w:val="808080"/>
-              </w:rPr>
-              <w:t>???</w:t>
+              <w:t>James Wilson</w:t>
             </w:r>
           </w:p>
         </w:tc>
@@ -4313,7 +4439,6 @@
               <w:pStyle w:val="TableText"/>
             </w:pPr>
             <w:r>
-              <w:lastRenderedPageBreak/>
               <w:t>Subject Matter Expert</w:t>
             </w:r>
           </w:p>
@@ -4341,15 +4466,23 @@
             <w:pPr>
               <w:pStyle w:val="TableText"/>
               <w:rPr>
-                <w:color w:val="808080"/>
-              </w:rPr>
-            </w:pPr>
-            <w:r>
-              <w:rPr>
-                <w:color w:val="808080"/>
-              </w:rPr>
-              <w:t>???</w:t>
-            </w:r>
+                <w:szCs w:val="20"/>
+              </w:rPr>
+            </w:pPr>
+            <w:r>
+              <w:rPr>
+                <w:szCs w:val="20"/>
+              </w:rPr>
+              <w:t xml:space="preserve">Drew </w:t>
+            </w:r>
+            <w:proofErr w:type="spellStart"/>
+            <w:r>
+              <w:rPr>
+                <w:szCs w:val="20"/>
+              </w:rPr>
+              <w:t>Maceachern</w:t>
+            </w:r>
+            <w:proofErr w:type="spellEnd"/>
           </w:p>
         </w:tc>
       </w:tr>
@@ -4380,27 +4513,6 @@
       <w:bookmarkEnd w:id="38"/>
       <w:bookmarkEnd w:id="39"/>
       <w:bookmarkEnd w:id="40"/>
-    </w:p>
-    <w:p>
-      <w:pPr>
-        <w:rPr>
-          <w:rFonts w:ascii="Verdana" w:hAnsi="Verdana"/>
-          <w:i/>
-          <w:color w:val="808080"/>
-          <w:sz w:val="20"/>
-          <w:lang w:eastAsia="en-US"/>
-        </w:rPr>
-      </w:pPr>
-      <w:r>
-        <w:rPr>
-          <w:rFonts w:ascii="Verdana" w:hAnsi="Verdana"/>
-          <w:i/>
-          <w:color w:val="808080"/>
-          <w:sz w:val="20"/>
-          <w:lang w:eastAsia="en-US"/>
-        </w:rPr>
-        <w:t>[Here is where you list any sort of hardware, labs, software, etc. that would be needed for the completion of the project]</w:t>
-      </w:r>
     </w:p>
     <w:p>
       <w:pPr>
@@ -4546,8 +4658,8 @@
         <w:tblLook w:val="01E0" w:firstRow="1" w:lastRow="1" w:firstColumn="1" w:lastColumn="1" w:noHBand="0" w:noVBand="0"/>
       </w:tblPr>
       <w:tblGrid>
-        <w:gridCol w:w="3796"/>
-        <w:gridCol w:w="5499"/>
+        <w:gridCol w:w="3794"/>
+        <w:gridCol w:w="5501"/>
       </w:tblGrid>
       <w:tr>
         <w:tc>
@@ -4687,6 +4799,20 @@
               <w:t>UI</w:t>
             </w:r>
           </w:p>
+          <w:p>
+            <w:pPr>
+              <w:pStyle w:val="BoxText"/>
+              <w:rPr>
+                <w:rFonts w:ascii="Verdana" w:hAnsi="Verdana"/>
+              </w:rPr>
+            </w:pPr>
+            <w:r>
+              <w:rPr>
+                <w:rFonts w:ascii="Verdana" w:hAnsi="Verdana"/>
+              </w:rPr>
+              <w:t>API</w:t>
+            </w:r>
+          </w:p>
         </w:tc>
         <w:tc>
           <w:tcPr>
@@ -4732,6 +4858,20 @@
                 <w:rFonts w:ascii="Verdana" w:hAnsi="Verdana"/>
               </w:rPr>
               <w:t>User Interface</w:t>
+            </w:r>
+          </w:p>
+          <w:p>
+            <w:pPr>
+              <w:pStyle w:val="BoxText"/>
+              <w:rPr>
+                <w:rFonts w:ascii="Verdana" w:hAnsi="Verdana"/>
+              </w:rPr>
+            </w:pPr>
+            <w:r>
+              <w:rPr>
+                <w:rFonts w:ascii="Verdana" w:hAnsi="Verdana"/>
+              </w:rPr>
+              <w:t>Application Programming Interface</w:t>
             </w:r>
           </w:p>
         </w:tc>
@@ -5256,7 +5396,6 @@
       <w:t xml:space="preserve">Weyland </w:t>
     </w:r>
     <w:proofErr w:type="spellStart"/>
-    <w:proofErr w:type="gramStart"/>
     <w:r>
       <w:rPr>
         <w:b/>
@@ -5272,16 +5411,7 @@
         <w:bCs/>
         <w:lang w:val="en-GB"/>
       </w:rPr>
-      <w:t xml:space="preserve"> :</w:t>
-    </w:r>
-    <w:proofErr w:type="gramEnd"/>
-    <w:r>
-      <w:rPr>
-        <w:b/>
-        <w:bCs/>
-        <w:lang w:val="en-GB"/>
-      </w:rPr>
-      <w:t xml:space="preserve"> Electronic Claims System</w:t>
+      <w:t xml:space="preserve"> : Electronic Claims System</w:t>
     </w:r>
   </w:p>
 </w:hdr>

</xml_diff>

<commit_message>
add milestone to charter
</commit_message>
<xml_diff>
--- a/_assets/projectDocs/Project Charter.docx
+++ b/_assets/projectDocs/Project Charter.docx
@@ -56,7 +56,25 @@
           <w:szCs w:val="56"/>
           <w:lang w:val="en-029"/>
         </w:rPr>
-        <w:t>Weyland Yutani : Electronic Claims System</w:t>
+        <w:t xml:space="preserve">Weyland </w:t>
+      </w:r>
+      <w:proofErr w:type="gramStart"/>
+      <w:r>
+        <w:rPr>
+          <w:sz w:val="56"/>
+          <w:szCs w:val="56"/>
+          <w:lang w:val="en-029"/>
+        </w:rPr>
+        <w:t>Yutani :</w:t>
+      </w:r>
+      <w:proofErr w:type="gramEnd"/>
+      <w:r>
+        <w:rPr>
+          <w:sz w:val="56"/>
+          <w:szCs w:val="56"/>
+          <w:lang w:val="en-029"/>
+        </w:rPr>
+        <w:t xml:space="preserve"> Electronic Claims System</w:t>
       </w:r>
     </w:p>
     <w:p>
@@ -430,16 +448,8 @@
               <w:rPr>
                 <w:szCs w:val="20"/>
               </w:rPr>
-              <w:t xml:space="preserve">Drew </w:t>
-            </w:r>
-            <w:proofErr w:type="spellStart"/>
-            <w:r>
-              <w:rPr>
-                <w:szCs w:val="20"/>
-              </w:rPr>
-              <w:t>Maceachern</w:t>
-            </w:r>
-            <w:proofErr w:type="spellEnd"/>
+              <w:t>Drew Maceachern</w:t>
+            </w:r>
           </w:p>
         </w:tc>
         <w:tc>
@@ -851,28 +861,103 @@
     </w:p>
     <w:p>
       <w:pPr>
-        <w:tabs>
-          <w:tab w:val="left" w:pos="8937"/>
-        </w:tabs>
-        <w:spacing w:before="360"/>
-        <w:ind w:right="-86"/>
-        <w:rPr>
-          <w:rFonts w:ascii="Verdana" w:hAnsi="Verdana"/>
-        </w:rPr>
-      </w:pPr>
-    </w:p>
-    <w:p>
-      <w:pPr>
         <w:pStyle w:val="Heading2"/>
       </w:pPr>
       <w:bookmarkStart w:id="7" w:name="_Toc195685104"/>
       <w:bookmarkStart w:id="8" w:name="_Toc201029885"/>
       <w:bookmarkStart w:id="9" w:name="_Toc207430131"/>
       <w:bookmarkStart w:id="10" w:name="_Toc342560524"/>
-      <w:r>
-        <w:lastRenderedPageBreak/>
-        <w:br w:type="page"/>
-      </w:r>
+    </w:p>
+    <w:p>
+      <w:pPr>
+        <w:rPr>
+          <w:lang w:eastAsia="en-US"/>
+        </w:rPr>
+      </w:pPr>
+    </w:p>
+    <w:p>
+      <w:pPr>
+        <w:rPr>
+          <w:lang w:eastAsia="en-US"/>
+        </w:rPr>
+      </w:pPr>
+    </w:p>
+    <w:p>
+      <w:pPr>
+        <w:rPr>
+          <w:lang w:eastAsia="en-US"/>
+        </w:rPr>
+      </w:pPr>
+    </w:p>
+    <w:p>
+      <w:pPr>
+        <w:rPr>
+          <w:lang w:eastAsia="en-US"/>
+        </w:rPr>
+      </w:pPr>
+    </w:p>
+    <w:p>
+      <w:pPr>
+        <w:rPr>
+          <w:lang w:eastAsia="en-US"/>
+        </w:rPr>
+      </w:pPr>
+    </w:p>
+    <w:p>
+      <w:pPr>
+        <w:rPr>
+          <w:lang w:eastAsia="en-US"/>
+        </w:rPr>
+      </w:pPr>
+    </w:p>
+    <w:p>
+      <w:pPr>
+        <w:rPr>
+          <w:lang w:eastAsia="en-US"/>
+        </w:rPr>
+      </w:pPr>
+    </w:p>
+    <w:p>
+      <w:pPr>
+        <w:rPr>
+          <w:lang w:eastAsia="en-US"/>
+        </w:rPr>
+      </w:pPr>
+    </w:p>
+    <w:p>
+      <w:pPr>
+        <w:rPr>
+          <w:lang w:eastAsia="en-US"/>
+        </w:rPr>
+      </w:pPr>
+    </w:p>
+    <w:p>
+      <w:pPr>
+        <w:rPr>
+          <w:lang w:eastAsia="en-US"/>
+        </w:rPr>
+      </w:pPr>
+    </w:p>
+    <w:p>
+      <w:pPr>
+        <w:rPr>
+          <w:lang w:eastAsia="en-US"/>
+        </w:rPr>
+      </w:pPr>
+    </w:p>
+    <w:p>
+      <w:pPr>
+        <w:rPr>
+          <w:lang w:eastAsia="en-US"/>
+        </w:rPr>
+      </w:pPr>
+    </w:p>
+    <w:p>
+      <w:pPr>
+        <w:rPr>
+          <w:lang w:eastAsia="en-US"/>
+        </w:rPr>
+      </w:pPr>
     </w:p>
     <w:p>
       <w:pPr>
@@ -1339,13 +1424,23 @@
           <w:szCs w:val="24"/>
         </w:rPr>
       </w:pPr>
+      <w:proofErr w:type="gramStart"/>
       <w:r>
         <w:rPr>
           <w:rFonts w:ascii="Verdana" w:hAnsi="Verdana" w:cs="Calibri"/>
           <w:sz w:val="20"/>
           <w:szCs w:val="24"/>
         </w:rPr>
-        <w:t>Admin submission of claims for employees.</w:t>
+        <w:t>Admin submission</w:t>
+      </w:r>
+      <w:proofErr w:type="gramEnd"/>
+      <w:r>
+        <w:rPr>
+          <w:rFonts w:ascii="Verdana" w:hAnsi="Verdana" w:cs="Calibri"/>
+          <w:sz w:val="20"/>
+          <w:szCs w:val="24"/>
+        </w:rPr>
+        <w:t xml:space="preserve"> of claims for employees.</w:t>
       </w:r>
     </w:p>
     <w:p>
@@ -1464,20 +1559,16 @@
           <w:numId w:val="16"/>
         </w:numPr>
         <w:rPr>
+          <w:rFonts w:ascii="Verdana" w:hAnsi="Verdana"/>
           <w:i/>
         </w:rPr>
       </w:pPr>
       <w:r>
         <w:rPr>
+          <w:rFonts w:ascii="Verdana" w:hAnsi="Verdana"/>
           <w:iCs/>
         </w:rPr>
-        <w:t>Money transfer to employees</w:t>
-      </w:r>
-      <w:r>
-        <w:rPr>
-          <w:iCs/>
-        </w:rPr>
-        <w:t>.</w:t>
+        <w:t>Money transfer to employees.</w:t>
       </w:r>
     </w:p>
     <w:p>
@@ -1488,11 +1579,13 @@
           <w:numId w:val="16"/>
         </w:numPr>
         <w:rPr>
+          <w:rFonts w:ascii="Verdana" w:hAnsi="Verdana"/>
           <w:i/>
         </w:rPr>
       </w:pPr>
       <w:r>
         <w:rPr>
+          <w:rFonts w:ascii="Verdana" w:hAnsi="Verdana"/>
           <w:iCs/>
         </w:rPr>
         <w:t>Notifications by email.</w:t>
@@ -1573,7 +1666,6 @@
                 <w:b/>
                 <w:szCs w:val="16"/>
               </w:rPr>
-              <w:lastRenderedPageBreak/>
               <w:t xml:space="preserve">Milestone </w:t>
             </w:r>
             <w:r>
@@ -1719,6 +1811,7 @@
               <w:rPr>
                 <w:rFonts w:ascii="Verdana" w:hAnsi="Verdana"/>
               </w:rPr>
+              <w:lastRenderedPageBreak/>
               <w:t xml:space="preserve">Due date: </w:t>
             </w:r>
           </w:p>
@@ -3118,16 +3211,8 @@
               <w:rPr>
                 <w:szCs w:val="20"/>
               </w:rPr>
-              <w:t xml:space="preserve">Drew </w:t>
-            </w:r>
-            <w:proofErr w:type="spellStart"/>
-            <w:r>
-              <w:rPr>
-                <w:szCs w:val="20"/>
-              </w:rPr>
-              <w:t>Maceachern</w:t>
-            </w:r>
-            <w:proofErr w:type="spellEnd"/>
+              <w:t>Drew Maceachern</w:t>
+            </w:r>
           </w:p>
         </w:tc>
         <w:tc>
@@ -3503,6 +3588,7 @@
           <w:rFonts w:ascii="Verdana" w:hAnsi="Verdana"/>
           <w:sz w:val="20"/>
         </w:rPr>
+        <w:lastRenderedPageBreak/>
         <w:t>Disorganized style leading to cumbersome code.</w:t>
       </w:r>
     </w:p>
@@ -3530,7 +3616,23 @@
           <w:rFonts w:ascii="Verdana" w:hAnsi="Verdana"/>
           <w:sz w:val="20"/>
         </w:rPr>
-        <w:t xml:space="preserve"> leading to confusion.</w:t>
+        <w:t xml:space="preserve"> </w:t>
+      </w:r>
+      <w:proofErr w:type="gramStart"/>
+      <w:r>
+        <w:rPr>
+          <w:rFonts w:ascii="Verdana" w:hAnsi="Verdana"/>
+          <w:sz w:val="20"/>
+        </w:rPr>
+        <w:t>leading</w:t>
+      </w:r>
+      <w:proofErr w:type="gramEnd"/>
+      <w:r>
+        <w:rPr>
+          <w:rFonts w:ascii="Verdana" w:hAnsi="Verdana"/>
+          <w:sz w:val="20"/>
+        </w:rPr>
+        <w:t xml:space="preserve"> to confusion.</w:t>
       </w:r>
     </w:p>
     <w:p>
@@ -3599,35 +3701,11 @@
         </w:rPr>
         <w:t>leading to project regression.</w:t>
       </w:r>
-    </w:p>
-    <w:p>
-      <w:pPr>
-        <w:pStyle w:val="ListParagraph"/>
-        <w:ind w:left="1080"/>
-        <w:rPr>
-          <w:rFonts w:ascii="Verdana" w:hAnsi="Verdana"/>
-          <w:sz w:val="20"/>
-        </w:rPr>
-      </w:pPr>
-    </w:p>
-    <w:p>
-      <w:pPr>
-        <w:rPr>
-          <w:rFonts w:ascii="Verdana" w:hAnsi="Verdana"/>
-          <w:sz w:val="20"/>
-        </w:rPr>
-      </w:pPr>
-    </w:p>
-    <w:p>
-      <w:pPr>
-        <w:pStyle w:val="Heading2"/>
-      </w:pPr>
       <w:bookmarkStart w:id="29" w:name="_Toc195685118"/>
       <w:bookmarkStart w:id="30" w:name="_Toc201029901"/>
       <w:bookmarkStart w:id="31" w:name="_Toc207430147"/>
       <w:bookmarkStart w:id="32" w:name="_Toc342560529"/>
       <w:r>
-        <w:lastRenderedPageBreak/>
         <w:br w:type="page"/>
       </w:r>
     </w:p>
@@ -3812,13 +3890,8 @@
               </w:rPr>
             </w:pPr>
             <w:r>
-              <w:t xml:space="preserve">Wayland </w:t>
-            </w:r>
-            <w:proofErr w:type="spellStart"/>
-            <w:r>
-              <w:t>Ytani</w:t>
-            </w:r>
-            <w:proofErr w:type="spellEnd"/>
+              <w:t>Wayland Ytani</w:t>
+            </w:r>
           </w:p>
         </w:tc>
       </w:tr>
@@ -3853,21 +3926,8 @@
               </w:rPr>
             </w:pPr>
             <w:r>
-              <w:t xml:space="preserve">Wayland </w:t>
-            </w:r>
-            <w:proofErr w:type="spellStart"/>
-            <w:r>
-              <w:t>Ytani</w:t>
-            </w:r>
-            <w:proofErr w:type="spellEnd"/>
-            <w:r>
-              <w:t xml:space="preserve"> </w:t>
-            </w:r>
-            <w:proofErr w:type="spellStart"/>
-            <w:r>
-              <w:t>Satff</w:t>
-            </w:r>
-            <w:proofErr w:type="spellEnd"/>
+              <w:t>Wayland Ytani Satff</w:t>
+            </w:r>
           </w:p>
         </w:tc>
       </w:tr>
@@ -3905,16 +3965,8 @@
               <w:rPr>
                 <w:szCs w:val="20"/>
               </w:rPr>
-              <w:t xml:space="preserve">Drew </w:t>
-            </w:r>
-            <w:proofErr w:type="spellStart"/>
-            <w:r>
-              <w:rPr>
-                <w:szCs w:val="20"/>
-              </w:rPr>
-              <w:t>Maceachern</w:t>
-            </w:r>
-            <w:proofErr w:type="spellEnd"/>
+              <w:t>Drew Maceachern</w:t>
+            </w:r>
           </w:p>
           <w:p>
             <w:pPr>
@@ -4162,16 +4214,8 @@
               <w:rPr>
                 <w:szCs w:val="20"/>
               </w:rPr>
-              <w:t xml:space="preserve">Drew </w:t>
-            </w:r>
-            <w:proofErr w:type="spellStart"/>
-            <w:r>
-              <w:rPr>
-                <w:szCs w:val="20"/>
-              </w:rPr>
-              <w:t>Maceachern</w:t>
-            </w:r>
-            <w:proofErr w:type="spellEnd"/>
+              <w:t>Drew Maceachern</w:t>
+            </w:r>
           </w:p>
         </w:tc>
       </w:tr>
@@ -4203,7 +4247,15 @@
               <w:pStyle w:val="TableText"/>
             </w:pPr>
             <w:r>
-              <w:t>Database and back end development</w:t>
+              <w:t xml:space="preserve">Database and </w:t>
+            </w:r>
+            <w:proofErr w:type="gramStart"/>
+            <w:r>
+              <w:t>back end</w:t>
+            </w:r>
+            <w:proofErr w:type="gramEnd"/>
+            <w:r>
+              <w:t xml:space="preserve"> development</w:t>
             </w:r>
           </w:p>
         </w:tc>
@@ -4253,7 +4305,15 @@
               <w:pStyle w:val="TableText"/>
             </w:pPr>
             <w:r>
-              <w:t>User interface design and back end development</w:t>
+              <w:t xml:space="preserve">User interface design and </w:t>
+            </w:r>
+            <w:proofErr w:type="gramStart"/>
+            <w:r>
+              <w:t>back end</w:t>
+            </w:r>
+            <w:proofErr w:type="gramEnd"/>
+            <w:r>
+              <w:t xml:space="preserve"> development</w:t>
             </w:r>
           </w:p>
         </w:tc>
@@ -4273,16 +4333,8 @@
               <w:rPr>
                 <w:szCs w:val="20"/>
               </w:rPr>
-              <w:t xml:space="preserve">Drew </w:t>
-            </w:r>
-            <w:proofErr w:type="spellStart"/>
-            <w:r>
-              <w:rPr>
-                <w:szCs w:val="20"/>
-              </w:rPr>
-              <w:t>Maceachern</w:t>
-            </w:r>
-            <w:proofErr w:type="spellEnd"/>
+              <w:t>Drew Maceachern</w:t>
+            </w:r>
           </w:p>
           <w:p>
             <w:pPr>
@@ -4348,16 +4400,8 @@
               <w:rPr>
                 <w:szCs w:val="20"/>
               </w:rPr>
-              <w:t xml:space="preserve">Drew </w:t>
-            </w:r>
-            <w:proofErr w:type="spellStart"/>
-            <w:r>
-              <w:rPr>
-                <w:szCs w:val="20"/>
-              </w:rPr>
-              <w:t>Maceachern</w:t>
-            </w:r>
-            <w:proofErr w:type="spellEnd"/>
+              <w:t>Drew Maceachern</w:t>
+            </w:r>
           </w:p>
           <w:p>
             <w:pPr>
@@ -4473,16 +4517,8 @@
               <w:rPr>
                 <w:szCs w:val="20"/>
               </w:rPr>
-              <w:t xml:space="preserve">Drew </w:t>
-            </w:r>
-            <w:proofErr w:type="spellStart"/>
-            <w:r>
-              <w:rPr>
-                <w:szCs w:val="20"/>
-              </w:rPr>
-              <w:t>Maceachern</w:t>
-            </w:r>
-            <w:proofErr w:type="spellEnd"/>
+              <w:t>Drew Maceachern</w:t>
+            </w:r>
           </w:p>
         </w:tc>
       </w:tr>
@@ -4600,20 +4636,10 @@
         </w:rPr>
         <w:t>Hardware Lab 309 supplies us with a web server.</w:t>
       </w:r>
-    </w:p>
-    <w:p>
-      <w:pPr>
-        <w:pStyle w:val="Heading2"/>
-      </w:pPr>
       <w:bookmarkStart w:id="41" w:name="_Toc195685124"/>
       <w:bookmarkStart w:id="42" w:name="_Toc201029907"/>
       <w:bookmarkStart w:id="43" w:name="_Toc207430153"/>
       <w:bookmarkStart w:id="44" w:name="_Toc342560532"/>
-    </w:p>
-    <w:p>
-      <w:pPr>
-        <w:pStyle w:val="Heading2"/>
-      </w:pPr>
       <w:r>
         <w:br w:type="page"/>
       </w:r>
@@ -5395,23 +5421,23 @@
       </w:rPr>
       <w:t xml:space="preserve">Weyland </w:t>
     </w:r>
-    <w:proofErr w:type="spellStart"/>
+    <w:proofErr w:type="gramStart"/>
     <w:r>
       <w:rPr>
         <w:b/>
         <w:bCs/>
         <w:lang w:val="en-GB"/>
       </w:rPr>
-      <w:t>Ytani</w:t>
+      <w:t>Ytani :</w:t>
     </w:r>
-    <w:proofErr w:type="spellEnd"/>
+    <w:proofErr w:type="gramEnd"/>
     <w:r>
       <w:rPr>
         <w:b/>
         <w:bCs/>
         <w:lang w:val="en-GB"/>
       </w:rPr>
-      <w:t xml:space="preserve"> : Electronic Claims System</w:t>
+      <w:t xml:space="preserve"> Electronic Claims System</w:t>
     </w:r>
   </w:p>
 </w:hdr>

</xml_diff>

<commit_message>
add erd to diagrams
</commit_message>
<xml_diff>
--- a/_assets/projectDocs/Project Charter.docx
+++ b/_assets/projectDocs/Project Charter.docx
@@ -56,25 +56,7 @@
           <w:szCs w:val="56"/>
           <w:lang w:val="en-029"/>
         </w:rPr>
-        <w:t xml:space="preserve">Weyland </w:t>
-      </w:r>
-      <w:proofErr w:type="gramStart"/>
-      <w:r>
-        <w:rPr>
-          <w:sz w:val="56"/>
-          <w:szCs w:val="56"/>
-          <w:lang w:val="en-029"/>
-        </w:rPr>
-        <w:t>Yutani :</w:t>
-      </w:r>
-      <w:proofErr w:type="gramEnd"/>
-      <w:r>
-        <w:rPr>
-          <w:sz w:val="56"/>
-          <w:szCs w:val="56"/>
-          <w:lang w:val="en-029"/>
-        </w:rPr>
-        <w:t xml:space="preserve"> Electronic Claims System</w:t>
+        <w:t>Weyland Yutani : Electronic Claims System</w:t>
       </w:r>
     </w:p>
     <w:p>
@@ -1424,23 +1406,13 @@
           <w:szCs w:val="24"/>
         </w:rPr>
       </w:pPr>
-      <w:proofErr w:type="gramStart"/>
       <w:r>
         <w:rPr>
           <w:rFonts w:ascii="Verdana" w:hAnsi="Verdana" w:cs="Calibri"/>
           <w:sz w:val="20"/>
           <w:szCs w:val="24"/>
         </w:rPr>
-        <w:t>Admin submission</w:t>
-      </w:r>
-      <w:proofErr w:type="gramEnd"/>
-      <w:r>
-        <w:rPr>
-          <w:rFonts w:ascii="Verdana" w:hAnsi="Verdana" w:cs="Calibri"/>
-          <w:sz w:val="20"/>
-          <w:szCs w:val="24"/>
-        </w:rPr>
-        <w:t xml:space="preserve"> of claims for employees.</w:t>
+        <w:t>Admin submission of claims for employees.</w:t>
       </w:r>
     </w:p>
     <w:p>
@@ -3616,23 +3588,7 @@
           <w:rFonts w:ascii="Verdana" w:hAnsi="Verdana"/>
           <w:sz w:val="20"/>
         </w:rPr>
-        <w:t xml:space="preserve"> </w:t>
-      </w:r>
-      <w:proofErr w:type="gramStart"/>
-      <w:r>
-        <w:rPr>
-          <w:rFonts w:ascii="Verdana" w:hAnsi="Verdana"/>
-          <w:sz w:val="20"/>
-        </w:rPr>
-        <w:t>leading</w:t>
-      </w:r>
-      <w:proofErr w:type="gramEnd"/>
-      <w:r>
-        <w:rPr>
-          <w:rFonts w:ascii="Verdana" w:hAnsi="Verdana"/>
-          <w:sz w:val="20"/>
-        </w:rPr>
-        <w:t xml:space="preserve"> to confusion.</w:t>
+        <w:t xml:space="preserve"> leading to confusion.</w:t>
       </w:r>
     </w:p>
     <w:p>
@@ -4247,15 +4203,7 @@
               <w:pStyle w:val="TableText"/>
             </w:pPr>
             <w:r>
-              <w:t xml:space="preserve">Database and </w:t>
-            </w:r>
-            <w:proofErr w:type="gramStart"/>
-            <w:r>
-              <w:t>back end</w:t>
-            </w:r>
-            <w:proofErr w:type="gramEnd"/>
-            <w:r>
-              <w:t xml:space="preserve"> development</w:t>
+              <w:t>Database and back end development</w:t>
             </w:r>
           </w:p>
         </w:tc>
@@ -4305,15 +4253,7 @@
               <w:pStyle w:val="TableText"/>
             </w:pPr>
             <w:r>
-              <w:t xml:space="preserve">User interface design and </w:t>
-            </w:r>
-            <w:proofErr w:type="gramStart"/>
-            <w:r>
-              <w:t>back end</w:t>
-            </w:r>
-            <w:proofErr w:type="gramEnd"/>
-            <w:r>
-              <w:t xml:space="preserve"> development</w:t>
+              <w:t>User interface design and back end development</w:t>
             </w:r>
           </w:p>
         </w:tc>
@@ -4839,6 +4779,20 @@
               <w:t>API</w:t>
             </w:r>
           </w:p>
+          <w:p>
+            <w:pPr>
+              <w:pStyle w:val="BoxText"/>
+              <w:rPr>
+                <w:rFonts w:ascii="Verdana" w:hAnsi="Verdana"/>
+              </w:rPr>
+            </w:pPr>
+            <w:r>
+              <w:rPr>
+                <w:rFonts w:ascii="Verdana" w:hAnsi="Verdana"/>
+              </w:rPr>
+              <w:t>DB</w:t>
+            </w:r>
+          </w:p>
         </w:tc>
         <w:tc>
           <w:tcPr>
@@ -4898,6 +4852,20 @@
                 <w:rFonts w:ascii="Verdana" w:hAnsi="Verdana"/>
               </w:rPr>
               <w:t>Application Programming Interface</w:t>
+            </w:r>
+          </w:p>
+          <w:p>
+            <w:pPr>
+              <w:pStyle w:val="BoxText"/>
+              <w:rPr>
+                <w:rFonts w:ascii="Verdana" w:hAnsi="Verdana"/>
+              </w:rPr>
+            </w:pPr>
+            <w:r>
+              <w:rPr>
+                <w:rFonts w:ascii="Verdana" w:hAnsi="Verdana"/>
+              </w:rPr>
+              <w:t>Data Base</w:t>
             </w:r>
           </w:p>
         </w:tc>
@@ -5419,25 +5387,7 @@
         <w:bCs/>
         <w:lang w:val="en-GB"/>
       </w:rPr>
-      <w:t xml:space="preserve">Weyland </w:t>
-    </w:r>
-    <w:proofErr w:type="gramStart"/>
-    <w:r>
-      <w:rPr>
-        <w:b/>
-        <w:bCs/>
-        <w:lang w:val="en-GB"/>
-      </w:rPr>
-      <w:t>Ytani :</w:t>
-    </w:r>
-    <w:proofErr w:type="gramEnd"/>
-    <w:r>
-      <w:rPr>
-        <w:b/>
-        <w:bCs/>
-        <w:lang w:val="en-GB"/>
-      </w:rPr>
-      <w:t xml:space="preserve"> Electronic Claims System</w:t>
+      <w:t>Weyland Ytani : Electronic Claims System</w:t>
     </w:r>
   </w:p>
 </w:hdr>

</xml_diff>

<commit_message>
update erd with travel info
</commit_message>
<xml_diff>
--- a/_assets/projectDocs/Project Charter.docx
+++ b/_assets/projectDocs/Project Charter.docx
@@ -762,21 +762,6 @@
         </w:rPr>
         <w:t>____________________________</w:t>
       </w:r>
-      <w:r>
-        <w:rPr>
-          <w:rFonts w:ascii="Verdana" w:hAnsi="Verdana"/>
-          <w:sz w:val="22"/>
-        </w:rPr>
-        <w:br/>
-      </w:r>
-      <w:r>
-        <w:rPr>
-          <w:rFonts w:ascii="Verdana" w:hAnsi="Verdana"/>
-          <w:color w:val="808080"/>
-          <w:sz w:val="22"/>
-        </w:rPr>
-        <w:t>[client 1 name, title]</w:t>
-      </w:r>
     </w:p>
     <w:p>
       <w:pPr>
@@ -825,21 +810,6 @@
         </w:rPr>
         <w:t>____________________________</w:t>
       </w:r>
-      <w:r>
-        <w:rPr>
-          <w:rFonts w:ascii="Verdana" w:hAnsi="Verdana"/>
-          <w:sz w:val="22"/>
-        </w:rPr>
-        <w:br/>
-      </w:r>
-      <w:r>
-        <w:rPr>
-          <w:rFonts w:ascii="Verdana" w:hAnsi="Verdana"/>
-          <w:color w:val="808080"/>
-          <w:sz w:val="22"/>
-        </w:rPr>
-        <w:t>[client 2 name, title] (if applicable)</w:t>
-      </w:r>
     </w:p>
     <w:p>
       <w:pPr>
@@ -946,7 +916,6 @@
         <w:pStyle w:val="Heading2"/>
       </w:pPr>
       <w:r>
-        <w:lastRenderedPageBreak/>
         <w:t>Section 2. Project Overview</w:t>
       </w:r>
       <w:bookmarkEnd w:id="7"/>
@@ -1013,6 +982,7 @@
           <w:rFonts w:ascii="Verdana" w:hAnsi="Verdana"/>
           <w:sz w:val="20"/>
         </w:rPr>
+        <w:lastRenderedPageBreak/>
         <w:t>The ECS will offer a simple and efficient way for employees to submit claims for evaluation</w:t>
       </w:r>
       <w:r>
@@ -1783,7 +1753,6 @@
               <w:rPr>
                 <w:rFonts w:ascii="Verdana" w:hAnsi="Verdana"/>
               </w:rPr>
-              <w:lastRenderedPageBreak/>
               <w:t xml:space="preserve">Due date: </w:t>
             </w:r>
           </w:p>
@@ -2067,6 +2036,7 @@
                 <w:b/>
                 <w:szCs w:val="16"/>
               </w:rPr>
+              <w:lastRenderedPageBreak/>
               <w:t>Milestone 3</w:t>
             </w:r>
             <w:r>
@@ -3560,7 +3530,6 @@
           <w:rFonts w:ascii="Verdana" w:hAnsi="Verdana"/>
           <w:sz w:val="20"/>
         </w:rPr>
-        <w:lastRenderedPageBreak/>
         <w:t>Disorganized style leading to cumbersome code.</w:t>
       </w:r>
     </w:p>

</xml_diff>